<commit_message>
Add automatic prefill for manual item direction review
</commit_message>
<xml_diff>
--- a/docs/add_health_wave01_manual_item_direction_review_script15.docx
+++ b/docs/add_health_wave01_manual_item_direction_review_script15.docx
@@ -7825,7 +7825,7 @@
                 <w:szCs w:val="16"/>
                 <w:color w:val="000000"/>
               </w:rPr>
-              <w:t xml:space="preserve">false</w:t>
+              <w:t xml:space="preserve">true</w:t>
             </w:r>
           </w:p>
         </w:tc>
@@ -7880,7 +7880,517 @@
                 <w:szCs w:val="16"/>
                 <w:color w:val="000000"/>
               </w:rPr>
-              <w:t xml:space="preserve">No completed manual review file found yet.</w:t>
+              <w:t xml:space="preserve"/>
+            </w:r>
+          </w:p>
+        </w:tc>
+      </w:tr>
+      <w:tr>
+        <w:trPr>
+          <w:trHeight w:val="416" w:hRule="auto"/>
+        </w:trPr>
+        <w:tc>
+          <w:tcPr>
+            <w:tcBorders>
+              <w:bottom w:val="none" w:sz="0" w:space="0" w:color="000000"/>
+              <w:top w:val="none" w:sz="0" w:space="0" w:color="000000"/>
+              <w:left w:val="none" w:sz="0" w:space="0" w:color="000000"/>
+              <w:right w:val="none" w:sz="0" w:space="0" w:color="000000"/>
+            </w:tcBorders>
+            <w:shd w:val="clear" w:color="auto" w:fill="FFFFFF"/>
+            <w:tcMar>
+              <w:top w:w="0" w:type="dxa"/>
+              <w:bottom w:w="0" w:type="dxa"/>
+              <w:left w:w="0" w:type="dxa"/>
+              <w:right w:w="0" w:type="dxa"/>
+            </w:tcMar>
+            <w:vAlign w:val="center"/>
+          </w:tcPr>
+          <w:p>
+            <w:pPr>
+              <w:pStyle w:val="Normal"/>
+              <w:jc w:val="left"/>
+              <w:pBdr>
+                <w:bottom w:val="none" w:sz="0" w:space="0" w:color="000000"/>
+                <w:top w:val="none" w:sz="0" w:space="0" w:color="000000"/>
+                <w:left w:val="none" w:sz="0" w:space="0" w:color="000000"/>
+                <w:right w:val="none" w:sz="0" w:space="0" w:color="000000"/>
+              </w:pBdr>
+              <w:spacing w:after="40" w:before="40" w:line="240"/>
+              <w:ind w:left="40" w:right="40" w:firstLine="0" w:firstLineChars="0"/>
+              <w:rPr>
+                <w:rFonts w:ascii="Arial" w:hAnsi="Arial" w:eastAsia="Arial" w:cs="Arial"/>
+                <w:i w:val="false"/>
+                <w:b w:val="false"/>
+                <w:u w:val="none"/>
+                <w:strike w:val="false"/>
+                <w:sz w:val="16"/>
+                <w:szCs w:val="16"/>
+                <w:color w:val="000000"/>
+              </w:rPr>
+            </w:pPr>
+            <w:r>
+              <w:rPr>
+                <w:rFonts w:ascii="Arial" w:hAnsi="Arial" w:eastAsia="Arial" w:cs="Arial"/>
+                <w:i w:val="false"/>
+                <w:b w:val="false"/>
+                <w:u w:val="none"/>
+                <w:strike w:val="false"/>
+                <w:sz w:val="16"/>
+                <w:szCs w:val="16"/>
+                <w:color w:val="000000"/>
+              </w:rPr>
+              <w:t xml:space="preserve">all_items_have_manual_final_role</w:t>
+            </w:r>
+          </w:p>
+        </w:tc>
+        <w:tc>
+          <w:tcPr>
+            <w:tcBorders>
+              <w:bottom w:val="none" w:sz="0" w:space="0" w:color="000000"/>
+              <w:top w:val="none" w:sz="0" w:space="0" w:color="000000"/>
+              <w:left w:val="none" w:sz="0" w:space="0" w:color="000000"/>
+              <w:right w:val="none" w:sz="0" w:space="0" w:color="000000"/>
+            </w:tcBorders>
+            <w:shd w:val="clear" w:color="auto" w:fill="FFFFFF"/>
+            <w:tcMar>
+              <w:top w:w="0" w:type="dxa"/>
+              <w:bottom w:w="0" w:type="dxa"/>
+              <w:left w:w="0" w:type="dxa"/>
+              <w:right w:w="0" w:type="dxa"/>
+            </w:tcMar>
+            <w:vAlign w:val="center"/>
+          </w:tcPr>
+          <w:p>
+            <w:pPr>
+              <w:pStyle w:val="Normal"/>
+              <w:jc w:val="right"/>
+              <w:pBdr>
+                <w:bottom w:val="none" w:sz="0" w:space="0" w:color="000000"/>
+                <w:top w:val="none" w:sz="0" w:space="0" w:color="000000"/>
+                <w:left w:val="none" w:sz="0" w:space="0" w:color="000000"/>
+                <w:right w:val="none" w:sz="0" w:space="0" w:color="000000"/>
+              </w:pBdr>
+              <w:spacing w:after="40" w:before="40" w:line="240"/>
+              <w:ind w:left="40" w:right="40" w:firstLine="0" w:firstLineChars="0"/>
+              <w:rPr>
+                <w:rFonts w:ascii="Arial" w:hAnsi="Arial" w:eastAsia="Arial" w:cs="Arial"/>
+                <w:i w:val="false"/>
+                <w:b w:val="false"/>
+                <w:u w:val="none"/>
+                <w:strike w:val="false"/>
+                <w:sz w:val="16"/>
+                <w:szCs w:val="16"/>
+                <w:color w:val="000000"/>
+              </w:rPr>
+            </w:pPr>
+            <w:r>
+              <w:rPr>
+                <w:rFonts w:ascii="Arial" w:hAnsi="Arial" w:eastAsia="Arial" w:cs="Arial"/>
+                <w:i w:val="false"/>
+                <w:b w:val="false"/>
+                <w:u w:val="none"/>
+                <w:strike w:val="false"/>
+                <w:sz w:val="16"/>
+                <w:szCs w:val="16"/>
+                <w:color w:val="000000"/>
+              </w:rPr>
+              <w:t xml:space="preserve">true</w:t>
+            </w:r>
+          </w:p>
+        </w:tc>
+        <w:tc>
+          <w:tcPr>
+            <w:tcBorders>
+              <w:bottom w:val="none" w:sz="0" w:space="0" w:color="000000"/>
+              <w:top w:val="none" w:sz="0" w:space="0" w:color="000000"/>
+              <w:left w:val="none" w:sz="0" w:space="0" w:color="000000"/>
+              <w:right w:val="none" w:sz="0" w:space="0" w:color="000000"/>
+            </w:tcBorders>
+            <w:shd w:val="clear" w:color="auto" w:fill="FFFFFF"/>
+            <w:tcMar>
+              <w:top w:w="0" w:type="dxa"/>
+              <w:bottom w:w="0" w:type="dxa"/>
+              <w:left w:w="0" w:type="dxa"/>
+              <w:right w:w="0" w:type="dxa"/>
+            </w:tcMar>
+            <w:vAlign w:val="center"/>
+          </w:tcPr>
+          <w:p>
+            <w:pPr>
+              <w:pStyle w:val="Normal"/>
+              <w:jc w:val="left"/>
+              <w:pBdr>
+                <w:bottom w:val="none" w:sz="0" w:space="0" w:color="000000"/>
+                <w:top w:val="none" w:sz="0" w:space="0" w:color="000000"/>
+                <w:left w:val="none" w:sz="0" w:space="0" w:color="000000"/>
+                <w:right w:val="none" w:sz="0" w:space="0" w:color="000000"/>
+              </w:pBdr>
+              <w:spacing w:after="40" w:before="40" w:line="240"/>
+              <w:ind w:left="40" w:right="40" w:firstLine="0" w:firstLineChars="0"/>
+              <w:rPr>
+                <w:rFonts w:ascii="Arial" w:hAnsi="Arial" w:eastAsia="Arial" w:cs="Arial"/>
+                <w:i w:val="false"/>
+                <w:b w:val="false"/>
+                <w:u w:val="none"/>
+                <w:strike w:val="false"/>
+                <w:sz w:val="16"/>
+                <w:szCs w:val="16"/>
+                <w:color w:val="000000"/>
+              </w:rPr>
+            </w:pPr>
+            <w:r>
+              <w:rPr>
+                <w:rFonts w:ascii="Arial" w:hAnsi="Arial" w:eastAsia="Arial" w:cs="Arial"/>
+                <w:i w:val="false"/>
+                <w:b w:val="false"/>
+                <w:u w:val="none"/>
+                <w:strike w:val="false"/>
+                <w:sz w:val="16"/>
+                <w:szCs w:val="16"/>
+                <w:color w:val="000000"/>
+              </w:rPr>
+              <w:t xml:space="preserve">Every item must have manual_final_role.</w:t>
+            </w:r>
+          </w:p>
+        </w:tc>
+      </w:tr>
+      <w:tr>
+        <w:trPr>
+          <w:trHeight w:val="416" w:hRule="auto"/>
+        </w:trPr>
+        <w:tc>
+          <w:tcPr>
+            <w:tcBorders>
+              <w:bottom w:val="none" w:sz="0" w:space="0" w:color="000000"/>
+              <w:top w:val="none" w:sz="0" w:space="0" w:color="000000"/>
+              <w:left w:val="none" w:sz="0" w:space="0" w:color="000000"/>
+              <w:right w:val="none" w:sz="0" w:space="0" w:color="000000"/>
+            </w:tcBorders>
+            <w:shd w:val="clear" w:color="auto" w:fill="FFFFFF"/>
+            <w:tcMar>
+              <w:top w:w="0" w:type="dxa"/>
+              <w:bottom w:w="0" w:type="dxa"/>
+              <w:left w:w="0" w:type="dxa"/>
+              <w:right w:w="0" w:type="dxa"/>
+            </w:tcMar>
+            <w:vAlign w:val="center"/>
+          </w:tcPr>
+          <w:p>
+            <w:pPr>
+              <w:pStyle w:val="Normal"/>
+              <w:jc w:val="left"/>
+              <w:pBdr>
+                <w:bottom w:val="none" w:sz="0" w:space="0" w:color="000000"/>
+                <w:top w:val="none" w:sz="0" w:space="0" w:color="000000"/>
+                <w:left w:val="none" w:sz="0" w:space="0" w:color="000000"/>
+                <w:right w:val="none" w:sz="0" w:space="0" w:color="000000"/>
+              </w:pBdr>
+              <w:spacing w:after="40" w:before="40" w:line="240"/>
+              <w:ind w:left="40" w:right="40" w:firstLine="0" w:firstLineChars="0"/>
+              <w:rPr>
+                <w:rFonts w:ascii="Arial" w:hAnsi="Arial" w:eastAsia="Arial" w:cs="Arial"/>
+                <w:i w:val="false"/>
+                <w:b w:val="false"/>
+                <w:u w:val="none"/>
+                <w:strike w:val="false"/>
+                <w:sz w:val="16"/>
+                <w:szCs w:val="16"/>
+                <w:color w:val="000000"/>
+              </w:rPr>
+            </w:pPr>
+            <w:r>
+              <w:rPr>
+                <w:rFonts w:ascii="Arial" w:hAnsi="Arial" w:eastAsia="Arial" w:cs="Arial"/>
+                <w:i w:val="false"/>
+                <w:b w:val="false"/>
+                <w:u w:val="none"/>
+                <w:strike w:val="false"/>
+                <w:sz w:val="16"/>
+                <w:szCs w:val="16"/>
+                <w:color w:val="000000"/>
+              </w:rPr>
+              <w:t xml:space="preserve">all_included_items_have_score_direction</w:t>
+            </w:r>
+          </w:p>
+        </w:tc>
+        <w:tc>
+          <w:tcPr>
+            <w:tcBorders>
+              <w:bottom w:val="none" w:sz="0" w:space="0" w:color="000000"/>
+              <w:top w:val="none" w:sz="0" w:space="0" w:color="000000"/>
+              <w:left w:val="none" w:sz="0" w:space="0" w:color="000000"/>
+              <w:right w:val="none" w:sz="0" w:space="0" w:color="000000"/>
+            </w:tcBorders>
+            <w:shd w:val="clear" w:color="auto" w:fill="FFFFFF"/>
+            <w:tcMar>
+              <w:top w:w="0" w:type="dxa"/>
+              <w:bottom w:w="0" w:type="dxa"/>
+              <w:left w:w="0" w:type="dxa"/>
+              <w:right w:w="0" w:type="dxa"/>
+            </w:tcMar>
+            <w:vAlign w:val="center"/>
+          </w:tcPr>
+          <w:p>
+            <w:pPr>
+              <w:pStyle w:val="Normal"/>
+              <w:jc w:val="right"/>
+              <w:pBdr>
+                <w:bottom w:val="none" w:sz="0" w:space="0" w:color="000000"/>
+                <w:top w:val="none" w:sz="0" w:space="0" w:color="000000"/>
+                <w:left w:val="none" w:sz="0" w:space="0" w:color="000000"/>
+                <w:right w:val="none" w:sz="0" w:space="0" w:color="000000"/>
+              </w:pBdr>
+              <w:spacing w:after="40" w:before="40" w:line="240"/>
+              <w:ind w:left="40" w:right="40" w:firstLine="0" w:firstLineChars="0"/>
+              <w:rPr>
+                <w:rFonts w:ascii="Arial" w:hAnsi="Arial" w:eastAsia="Arial" w:cs="Arial"/>
+                <w:i w:val="false"/>
+                <w:b w:val="false"/>
+                <w:u w:val="none"/>
+                <w:strike w:val="false"/>
+                <w:sz w:val="16"/>
+                <w:szCs w:val="16"/>
+                <w:color w:val="000000"/>
+              </w:rPr>
+            </w:pPr>
+            <w:r>
+              <w:rPr>
+                <w:rFonts w:ascii="Arial" w:hAnsi="Arial" w:eastAsia="Arial" w:cs="Arial"/>
+                <w:i w:val="false"/>
+                <w:b w:val="false"/>
+                <w:u w:val="none"/>
+                <w:strike w:val="false"/>
+                <w:sz w:val="16"/>
+                <w:szCs w:val="16"/>
+                <w:color w:val="000000"/>
+              </w:rPr>
+              <w:t xml:space="preserve">true</w:t>
+            </w:r>
+          </w:p>
+        </w:tc>
+        <w:tc>
+          <w:tcPr>
+            <w:tcBorders>
+              <w:bottom w:val="none" w:sz="0" w:space="0" w:color="000000"/>
+              <w:top w:val="none" w:sz="0" w:space="0" w:color="000000"/>
+              <w:left w:val="none" w:sz="0" w:space="0" w:color="000000"/>
+              <w:right w:val="none" w:sz="0" w:space="0" w:color="000000"/>
+            </w:tcBorders>
+            <w:shd w:val="clear" w:color="auto" w:fill="FFFFFF"/>
+            <w:tcMar>
+              <w:top w:w="0" w:type="dxa"/>
+              <w:bottom w:w="0" w:type="dxa"/>
+              <w:left w:w="0" w:type="dxa"/>
+              <w:right w:w="0" w:type="dxa"/>
+            </w:tcMar>
+            <w:vAlign w:val="center"/>
+          </w:tcPr>
+          <w:p>
+            <w:pPr>
+              <w:pStyle w:val="Normal"/>
+              <w:jc w:val="left"/>
+              <w:pBdr>
+                <w:bottom w:val="none" w:sz="0" w:space="0" w:color="000000"/>
+                <w:top w:val="none" w:sz="0" w:space="0" w:color="000000"/>
+                <w:left w:val="none" w:sz="0" w:space="0" w:color="000000"/>
+                <w:right w:val="none" w:sz="0" w:space="0" w:color="000000"/>
+              </w:pBdr>
+              <w:spacing w:after="40" w:before="40" w:line="240"/>
+              <w:ind w:left="40" w:right="40" w:firstLine="0" w:firstLineChars="0"/>
+              <w:rPr>
+                <w:rFonts w:ascii="Arial" w:hAnsi="Arial" w:eastAsia="Arial" w:cs="Arial"/>
+                <w:i w:val="false"/>
+                <w:b w:val="false"/>
+                <w:u w:val="none"/>
+                <w:strike w:val="false"/>
+                <w:sz w:val="16"/>
+                <w:szCs w:val="16"/>
+                <w:color w:val="000000"/>
+              </w:rPr>
+            </w:pPr>
+            <w:r>
+              <w:rPr>
+                <w:rFonts w:ascii="Arial" w:hAnsi="Arial" w:eastAsia="Arial" w:cs="Arial"/>
+                <w:i w:val="false"/>
+                <w:b w:val="false"/>
+                <w:u w:val="none"/>
+                <w:strike w:val="false"/>
+                <w:sz w:val="16"/>
+                <w:szCs w:val="16"/>
+                <w:color w:val="000000"/>
+              </w:rPr>
+              <w:t xml:space="preserve">Included items must have manual_score_direction.</w:t>
+            </w:r>
+          </w:p>
+        </w:tc>
+      </w:tr>
+      <w:tr>
+        <w:trPr>
+          <w:trHeight w:val="416" w:hRule="auto"/>
+        </w:trPr>
+        <w:tc>
+          <w:tcPr>
+            <w:tcBorders>
+              <w:bottom w:val="none" w:sz="0" w:space="0" w:color="000000"/>
+              <w:top w:val="none" w:sz="0" w:space="0" w:color="000000"/>
+              <w:left w:val="none" w:sz="0" w:space="0" w:color="000000"/>
+              <w:right w:val="none" w:sz="0" w:space="0" w:color="000000"/>
+            </w:tcBorders>
+            <w:shd w:val="clear" w:color="auto" w:fill="FFFFFF"/>
+            <w:tcMar>
+              <w:top w:w="0" w:type="dxa"/>
+              <w:bottom w:w="0" w:type="dxa"/>
+              <w:left w:w="0" w:type="dxa"/>
+              <w:right w:w="0" w:type="dxa"/>
+            </w:tcMar>
+            <w:vAlign w:val="center"/>
+          </w:tcPr>
+          <w:p>
+            <w:pPr>
+              <w:pStyle w:val="Normal"/>
+              <w:jc w:val="left"/>
+              <w:pBdr>
+                <w:bottom w:val="none" w:sz="0" w:space="0" w:color="000000"/>
+                <w:top w:val="none" w:sz="0" w:space="0" w:color="000000"/>
+                <w:left w:val="none" w:sz="0" w:space="0" w:color="000000"/>
+                <w:right w:val="none" w:sz="0" w:space="0" w:color="000000"/>
+              </w:pBdr>
+              <w:spacing w:after="40" w:before="40" w:line="240"/>
+              <w:ind w:left="40" w:right="40" w:firstLine="0" w:firstLineChars="0"/>
+              <w:rPr>
+                <w:rFonts w:ascii="Arial" w:hAnsi="Arial" w:eastAsia="Arial" w:cs="Arial"/>
+                <w:i w:val="false"/>
+                <w:b w:val="false"/>
+                <w:u w:val="none"/>
+                <w:strike w:val="false"/>
+                <w:sz w:val="16"/>
+                <w:szCs w:val="16"/>
+                <w:color w:val="000000"/>
+              </w:rPr>
+            </w:pPr>
+            <w:r>
+              <w:rPr>
+                <w:rFonts w:ascii="Arial" w:hAnsi="Arial" w:eastAsia="Arial" w:cs="Arial"/>
+                <w:i w:val="false"/>
+                <w:b w:val="false"/>
+                <w:u w:val="none"/>
+                <w:strike w:val="false"/>
+                <w:sz w:val="16"/>
+                <w:szCs w:val="16"/>
+                <w:color w:val="000000"/>
+              </w:rPr>
+              <w:t xml:space="preserve">all_included_items_have_reverse_score_decision</w:t>
+            </w:r>
+          </w:p>
+        </w:tc>
+        <w:tc>
+          <w:tcPr>
+            <w:tcBorders>
+              <w:bottom w:val="none" w:sz="0" w:space="0" w:color="000000"/>
+              <w:top w:val="none" w:sz="0" w:space="0" w:color="000000"/>
+              <w:left w:val="none" w:sz="0" w:space="0" w:color="000000"/>
+              <w:right w:val="none" w:sz="0" w:space="0" w:color="000000"/>
+            </w:tcBorders>
+            <w:shd w:val="clear" w:color="auto" w:fill="FFFFFF"/>
+            <w:tcMar>
+              <w:top w:w="0" w:type="dxa"/>
+              <w:bottom w:w="0" w:type="dxa"/>
+              <w:left w:w="0" w:type="dxa"/>
+              <w:right w:w="0" w:type="dxa"/>
+            </w:tcMar>
+            <w:vAlign w:val="center"/>
+          </w:tcPr>
+          <w:p>
+            <w:pPr>
+              <w:pStyle w:val="Normal"/>
+              <w:jc w:val="right"/>
+              <w:pBdr>
+                <w:bottom w:val="none" w:sz="0" w:space="0" w:color="000000"/>
+                <w:top w:val="none" w:sz="0" w:space="0" w:color="000000"/>
+                <w:left w:val="none" w:sz="0" w:space="0" w:color="000000"/>
+                <w:right w:val="none" w:sz="0" w:space="0" w:color="000000"/>
+              </w:pBdr>
+              <w:spacing w:after="40" w:before="40" w:line="240"/>
+              <w:ind w:left="40" w:right="40" w:firstLine="0" w:firstLineChars="0"/>
+              <w:rPr>
+                <w:rFonts w:ascii="Arial" w:hAnsi="Arial" w:eastAsia="Arial" w:cs="Arial"/>
+                <w:i w:val="false"/>
+                <w:b w:val="false"/>
+                <w:u w:val="none"/>
+                <w:strike w:val="false"/>
+                <w:sz w:val="16"/>
+                <w:szCs w:val="16"/>
+                <w:color w:val="000000"/>
+              </w:rPr>
+            </w:pPr>
+            <w:r>
+              <w:rPr>
+                <w:rFonts w:ascii="Arial" w:hAnsi="Arial" w:eastAsia="Arial" w:cs="Arial"/>
+                <w:i w:val="false"/>
+                <w:b w:val="false"/>
+                <w:u w:val="none"/>
+                <w:strike w:val="false"/>
+                <w:sz w:val="16"/>
+                <w:szCs w:val="16"/>
+                <w:color w:val="000000"/>
+              </w:rPr>
+              <w:t xml:space="preserve">true</w:t>
+            </w:r>
+          </w:p>
+        </w:tc>
+        <w:tc>
+          <w:tcPr>
+            <w:tcBorders>
+              <w:bottom w:val="none" w:sz="0" w:space="0" w:color="000000"/>
+              <w:top w:val="none" w:sz="0" w:space="0" w:color="000000"/>
+              <w:left w:val="none" w:sz="0" w:space="0" w:color="000000"/>
+              <w:right w:val="none" w:sz="0" w:space="0" w:color="000000"/>
+            </w:tcBorders>
+            <w:shd w:val="clear" w:color="auto" w:fill="FFFFFF"/>
+            <w:tcMar>
+              <w:top w:w="0" w:type="dxa"/>
+              <w:bottom w:w="0" w:type="dxa"/>
+              <w:left w:w="0" w:type="dxa"/>
+              <w:right w:w="0" w:type="dxa"/>
+            </w:tcMar>
+            <w:vAlign w:val="center"/>
+          </w:tcPr>
+          <w:p>
+            <w:pPr>
+              <w:pStyle w:val="Normal"/>
+              <w:jc w:val="left"/>
+              <w:pBdr>
+                <w:bottom w:val="none" w:sz="0" w:space="0" w:color="000000"/>
+                <w:top w:val="none" w:sz="0" w:space="0" w:color="000000"/>
+                <w:left w:val="none" w:sz="0" w:space="0" w:color="000000"/>
+                <w:right w:val="none" w:sz="0" w:space="0" w:color="000000"/>
+              </w:pBdr>
+              <w:spacing w:after="40" w:before="40" w:line="240"/>
+              <w:ind w:left="40" w:right="40" w:firstLine="0" w:firstLineChars="0"/>
+              <w:rPr>
+                <w:rFonts w:ascii="Arial" w:hAnsi="Arial" w:eastAsia="Arial" w:cs="Arial"/>
+                <w:i w:val="false"/>
+                <w:b w:val="false"/>
+                <w:u w:val="none"/>
+                <w:strike w:val="false"/>
+                <w:sz w:val="16"/>
+                <w:szCs w:val="16"/>
+                <w:color w:val="000000"/>
+              </w:rPr>
+            </w:pPr>
+            <w:r>
+              <w:rPr>
+                <w:rFonts w:ascii="Arial" w:hAnsi="Arial" w:eastAsia="Arial" w:cs="Arial"/>
+                <w:i w:val="false"/>
+                <w:b w:val="false"/>
+                <w:u w:val="none"/>
+                <w:strike w:val="false"/>
+                <w:sz w:val="16"/>
+                <w:szCs w:val="16"/>
+                <w:color w:val="000000"/>
+              </w:rPr>
+              <w:t xml:space="preserve">Included items must have manual_reverse_score decision.</w:t>
             </w:r>
           </w:p>
         </w:tc>
@@ -7940,7 +8450,7 @@
                 <w:szCs w:val="16"/>
                 <w:color w:val="000000"/>
               </w:rPr>
-              <w:t xml:space="preserve">manual_review_required_before_final_indices</w:t>
+              <w:t xml:space="preserve">all_items_have_include_decision</w:t>
             </w:r>
           </w:p>
         </w:tc>
@@ -8050,7 +8560,7 @@
                 <w:szCs w:val="16"/>
                 <w:color w:val="000000"/>
               </w:rPr>
-              <w:t xml:space="preserve">Use the WORKING_COPY file, fill the manual fields, then save a completed version as script15_manual_item_direction_review_COMPLETED.csv.</w:t>
+              <w:t xml:space="preserve">Every item must have manual_include_in_index.</w:t>
             </w:r>
           </w:p>
         </w:tc>

</xml_diff>